<commit_message>
first functional version of the program is complete. Creates and Plots fourier transform of the given sphere
</commit_message>
<xml_diff>
--- a/misc/Final Project Progress Update.docx
+++ b/misc/Final Project Progress Update.docx
@@ -10,45 +10,33 @@
     <w:p/>
     <w:p>
       <w:r>
-        <w:t xml:space="preserve">My initial idea for my final project is essentially unchanged from my last update. </w:t>
-      </w:r>
-      <w:r>
-        <w:t xml:space="preserve">My plan is to create some </w:t>
-      </w:r>
-      <w:proofErr w:type="spellStart"/>
-      <w:r>
-        <w:t>c++</w:t>
-      </w:r>
-      <w:proofErr w:type="spellEnd"/>
-      <w:r>
-        <w:t xml:space="preserve"> code, which takes arguments via command line. The command line arguments control the specifics of the spherical harmonic to create. After that, the code will, if told to, do the </w:t>
-      </w:r>
-      <w:proofErr w:type="spellStart"/>
-      <w:r>
-        <w:t>fourier</w:t>
-      </w:r>
-      <w:proofErr w:type="spellEnd"/>
-      <w:r>
-        <w:t xml:space="preserve"> transform on that spherical harmonic. Both results are output to files. Additionally, I will have a python script that will build the C++ code for the user, run the calculator, then read the output of the </w:t>
-      </w:r>
-      <w:proofErr w:type="spellStart"/>
-      <w:r>
-        <w:t>fourier</w:t>
-      </w:r>
-      <w:proofErr w:type="spellEnd"/>
-      <w:r>
-        <w:t xml:space="preserve"> transform file and plot it.</w:t>
+        <w:t xml:space="preserve">My goal for the final project is to plot the power spectrum of a function(\theta,\phi) after doing the fourier transform on it. </w:t>
       </w:r>
     </w:p>
     <w:p>
       <w:r>
-        <w:t>I spent some time reading/researching on spherical harmonics and Fourier transforms. I am mostly confident I will be able to implement the idea discussed above</w:t>
+        <w:t>The first step of this is to create the function we want to transform. This involves creating shapes (squares, circles, rectangles) and mapping them to a sphere of a specified size.</w:t>
+      </w:r>
+    </w:p>
+    <w:p>
+      <w:r>
+        <w:t>The next step is to calculate the spherical harmonics, as they are required to do the fourier transform in spherical coordinates. This will be done by using GSL to get the Legendre polynomials, and coding the rest of the spherical harmonic myself.</w:t>
+      </w:r>
+    </w:p>
+    <w:p>
+      <w:r>
+        <w:t xml:space="preserve">Then, now that we have f(\theta, \phi) and Y_lm(\theta, \phi), we calculate c_lm by doing \integral(f * Y_lm). Repeating this process </w:t>
       </w:r>
       <w:r>
-        <w:t xml:space="preserve"> correctly</w:t>
+        <w:t xml:space="preserve">across all lm combos </w:t>
       </w:r>
       <w:r>
-        <w:t>.</w:t>
+        <w:t>gets us our desired result.</w:t>
+      </w:r>
+    </w:p>
+    <w:p>
+      <w:r>
+        <w:t>Finally, I will plot the result, with l(l+1)c_lm on the x axis, and L on the y axis</w:t>
       </w:r>
     </w:p>
     <w:p>
@@ -59,15 +47,7 @@
         <w:t xml:space="preserve">, </w:t>
       </w:r>
       <w:r>
-        <w:t xml:space="preserve">creating the files and classes that I plan to implement (in both C++ and python), and getting the </w:t>
-      </w:r>
-      <w:proofErr w:type="spellStart"/>
-      <w:r>
-        <w:t>github</w:t>
-      </w:r>
-      <w:proofErr w:type="spellEnd"/>
-      <w:r>
-        <w:t xml:space="preserve"> repository setup (</w:t>
+        <w:t>creating the files and classes that I plan to implement (in both C++ and python), and getting the github repository setup (</w:t>
       </w:r>
       <w:hyperlink r:id="rId8" w:history="1">
         <w:r>
@@ -89,15 +69,7 @@
     </w:p>
     <w:p>
       <w:r>
-        <w:t xml:space="preserve">My main concern is that I am not sure how much work is required for the final project. I am confident I can meet </w:t>
-      </w:r>
-      <w:proofErr w:type="gramStart"/>
-      <w:r>
-        <w:t>all of</w:t>
-      </w:r>
-      <w:proofErr w:type="gramEnd"/>
-      <w:r>
-        <w:t xml:space="preserve"> the rubric’s criteria (outside of the questions I h</w:t>
+        <w:t>My main concern is that I am not sure how much work is required for the final project. I am confident I can meet all of the rubric’s criteria (outside of the questions I h</w:t>
       </w:r>
       <w:r>
         <w:t>ave below</w:t>
@@ -108,15 +80,7 @@
     </w:p>
     <w:p>
       <w:r>
-        <w:t xml:space="preserve">On </w:t>
-      </w:r>
-      <w:proofErr w:type="gramStart"/>
-      <w:r>
-        <w:t>the rubric’s</w:t>
-      </w:r>
-      <w:proofErr w:type="gramEnd"/>
-      <w:r>
-        <w:t xml:space="preserve"> criteria:</w:t>
+        <w:t>On the rubric’s criteria:</w:t>
       </w:r>
     </w:p>
     <w:p>
@@ -128,31 +92,7 @@
         </w:numPr>
       </w:pPr>
       <w:r>
-        <w:t xml:space="preserve">It says we </w:t>
-      </w:r>
-      <w:proofErr w:type="gramStart"/>
-      <w:r>
-        <w:t>have to</w:t>
-      </w:r>
-      <w:proofErr w:type="gramEnd"/>
-      <w:r>
-        <w:t xml:space="preserve"> have plot files. Do you mean saved pdf files, or .</w:t>
-      </w:r>
-      <w:proofErr w:type="spellStart"/>
-      <w:r>
-        <w:t>plt</w:t>
-      </w:r>
-      <w:proofErr w:type="spellEnd"/>
-      <w:r>
-        <w:t xml:space="preserve"> files that </w:t>
-      </w:r>
-      <w:proofErr w:type="spellStart"/>
-      <w:r>
-        <w:t>gnuplot</w:t>
-      </w:r>
-      <w:proofErr w:type="spellEnd"/>
-      <w:r>
-        <w:t xml:space="preserve"> can use? My plan was to use python, and you’ve said we can do python for plotting, so I imagine it’s the former, but I wanted to verify.</w:t>
+        <w:t>It says we have to have plot files. Do you mean saved pdf files, or .plt files that gnuplot can use? My plan was to use python, and you’ve said we can do python for plotting, so I imagine it’s the former, but I wanted to verify.</w:t>
       </w:r>
     </w:p>
     <w:p>
@@ -164,15 +104,7 @@
         </w:numPr>
       </w:pPr>
       <w:r>
-        <w:t xml:space="preserve">On the commenting/variable naming: It says to have thorough commenting. In many of the code samples we have gotten throughout the class, many of them label the variables with descriptions of what they are. But the variable naming part also says that our variable names should be self-explanatory (as they should be). Do I need to do the explicit commenting on every variable, or is explaining what each function does </w:t>
-      </w:r>
-      <w:proofErr w:type="gramStart"/>
-      <w:r>
-        <w:t>sufficient</w:t>
-      </w:r>
-      <w:proofErr w:type="gramEnd"/>
-      <w:r>
-        <w:t xml:space="preserve">? </w:t>
+        <w:t xml:space="preserve">On the commenting/variable naming: It says to have thorough commenting. In many of the code samples we have gotten throughout the class, many of them label the variables with descriptions of what they are. But the variable naming part also says that our variable names should be self-explanatory (as they should be). Do I need to do the explicit commenting on every variable, or is explaining what each function does sufficient? </w:t>
       </w:r>
     </w:p>
     <w:sectPr>
@@ -1141,6 +1073,7 @@
   <w:style w:type="character" w:default="1" w:styleId="DefaultParagraphFont">
     <w:name w:val="Default Paragraph Font"/>
     <w:uiPriority w:val="1"/>
+    <w:semiHidden/>
     <w:unhideWhenUsed/>
   </w:style>
   <w:style w:type="table" w:default="1" w:styleId="TableNormal">
@@ -2049,16 +1982,9 @@
 <file path=customXml/itemProps3.xml><?xml version="1.0" encoding="utf-8"?>
 <ds:datastoreItem xmlns:ds="http://schemas.openxmlformats.org/officeDocument/2006/customXml" ds:itemID="{D23A5F16-4FA2-4D4B-98E0-CB3D596DCA6A}">
   <ds:schemaRefs>
-    <ds:schemaRef ds:uri="http://purl.org/dc/elements/1.1/"/>
     <ds:schemaRef ds:uri="http://schemas.microsoft.com/office/2006/metadata/properties"/>
-    <ds:schemaRef ds:uri="http://purl.org/dc/terms/"/>
-    <ds:schemaRef ds:uri="http://schemas.microsoft.com/office/2006/documentManagement/types"/>
-    <ds:schemaRef ds:uri="http://purl.org/dc/dcmitype/"/>
+    <ds:schemaRef ds:uri="http://schemas.microsoft.com/office/infopath/2007/PartnerControls"/>
     <ds:schemaRef ds:uri="5895d4a5-981b-4d66-ac82-08620118c8b7"/>
-    <ds:schemaRef ds:uri="http://schemas.microsoft.com/office/infopath/2007/PartnerControls"/>
-    <ds:schemaRef ds:uri="http://schemas.openxmlformats.org/package/2006/metadata/core-properties"/>
-    <ds:schemaRef ds:uri="67bfcf2a-fa2d-465d-8014-5da8f5caeac9"/>
-    <ds:schemaRef ds:uri="http://www.w3.org/XML/1998/namespace"/>
   </ds:schemaRefs>
 </ds:datastoreItem>
 </file>
</xml_diff>